<commit_message>
feat: Add Scope 1-2-3 Donut Chart, Scope 3 category breakdown modal, separate Local Transport, high-contrast executive UI, and compact section headers
</commit_message>
<xml_diff>
--- a/MICE_온실가스_감축_계산산식_및_국제기준_보고서.docx
+++ b/MICE_온실가스_감축_계산산식_및_국제기준_보고서.docx
@@ -1456,6 +1456,189 @@
     </w:p>
     <w:p>
       <w:pPr>
+        <w:pStyle w:val="Heading2"/>
+        <w:spacing w:before="200" w:after="80"/>
+      </w:pPr>
+      <w:r>
+        <w:rPr>
+          <w:rFonts w:ascii="Malgun Gothic" w:hAnsi="Malgun Gothic"/>
+          <w:b/>
+          <w:color w:val="0F172A"/>
+          <w:sz w:val="24"/>
+        </w:rPr>
+        <w:t>⑨ 현지 교통 및 셔틀 운행 (Local Transportation - 가이드라인 제5장)</w:t>
+      </w:r>
+    </w:p>
+    <w:tbl>
+      <w:tblPr>
+        <w:tblW w:type="auto" w:w="0"/>
+        <w:jc w:val="center"/>
+        <w:tblLayout w:type="fixed"/>
+        <w:tblLook w:firstColumn="1" w:firstRow="1" w:lastColumn="0" w:lastRow="0" w:noHBand="0" w:noVBand="1" w:val="04A0"/>
+      </w:tblPr>
+      <w:tblGrid>
+        <w:gridCol w:w="4680"/>
+        <w:gridCol w:w="4680"/>
+      </w:tblGrid>
+      <w:tr>
+        <w:tc>
+          <w:tcPr>
+            <w:tcW w:type="dxa" w:w="2016"/>
+            <w:shd w:fill="F1F5F9"/>
+            <w:tcMar>
+              <w:top w:w="80" w:type="dxa"/>
+              <w:bottom w:w="80" w:type="dxa"/>
+              <w:left w:w="100" w:type="dxa"/>
+              <w:right w:w="100" w:type="dxa"/>
+            </w:tcMar>
+          </w:tcPr>
+          <w:p>
+            <w:r>
+              <w:rPr>
+                <w:rFonts w:ascii="Malgun Gothic" w:hAnsi="Malgun Gothic"/>
+                <w:b/>
+                <w:color w:val="334155"/>
+                <w:sz w:val="19"/>
+              </w:rPr>
+              <w:t>적용 대상</w:t>
+            </w:r>
+          </w:p>
+        </w:tc>
+        <w:tc>
+          <w:tcPr>
+            <w:tcW w:type="dxa" w:w="7344"/>
+            <w:tcMar>
+              <w:top w:w="80" w:type="dxa"/>
+              <w:bottom w:w="80" w:type="dxa"/>
+              <w:left w:w="100" w:type="dxa"/>
+              <w:right w:w="100" w:type="dxa"/>
+            </w:tcMar>
+          </w:tcPr>
+          <w:p>
+            <w:r>
+              <w:rPr>
+                <w:rFonts w:ascii="Malgun Gothic" w:hAnsi="Malgun Gothic"/>
+                <w:sz w:val="19"/>
+              </w:rPr>
+              <w:t>행사 목적지 도시 내 공항/역 ↔ 호텔, 호텔 ↔ 행사장 간 육상 이동 배출량 및 셔틀 전환 감축 산정</w:t>
+            </w:r>
+          </w:p>
+        </w:tc>
+      </w:tr>
+      <w:tr>
+        <w:tc>
+          <w:tcPr>
+            <w:tcW w:type="dxa" w:w="2016"/>
+            <w:shd w:fill="F1F5F9"/>
+            <w:tcMar>
+              <w:top w:w="80" w:type="dxa"/>
+              <w:bottom w:w="80" w:type="dxa"/>
+              <w:left w:w="100" w:type="dxa"/>
+              <w:right w:w="100" w:type="dxa"/>
+            </w:tcMar>
+          </w:tcPr>
+          <w:p>
+            <w:r>
+              <w:rPr>
+                <w:rFonts w:ascii="Malgun Gothic" w:hAnsi="Malgun Gothic"/>
+                <w:b/>
+                <w:color w:val="334155"/>
+                <w:sz w:val="19"/>
+              </w:rPr>
+              <w:t>계산 산식</w:t>
+            </w:r>
+          </w:p>
+        </w:tc>
+        <w:tc>
+          <w:tcPr>
+            <w:tcW w:type="dxa" w:w="7344"/>
+            <w:tcMar>
+              <w:top w:w="80" w:type="dxa"/>
+              <w:bottom w:w="80" w:type="dxa"/>
+              <w:left w:w="100" w:type="dxa"/>
+              <w:right w:w="100" w:type="dxa"/>
+            </w:tcMar>
+          </w:tcPr>
+          <w:p>
+            <w:r>
+              <w:rPr>
+                <w:rFonts w:ascii="Malgun Gothic" w:hAnsi="Malgun Gothic"/>
+                <w:b/>
+                <w:color w:val="047857"/>
+                <w:sz w:val="19"/>
+              </w:rPr>
+              <w:t>• 5.1 측정 경계: 공항/역↔호텔, 호텔↔행사장 이동(연소+WTT 포함, 사적 우회/관광 제외)</w:t>
+              <w:br/>
+              <w:t>• 5.2 기본 가정: 1인 1일 왕복 25km, 전시회 1일/컨퍼런스 N일, 카풀 대당 1.5명</w:t>
+              <w:br/>
+              <w:t>• 수단 배분: 셔틀 제공 시(셔틀 50%, 택시 30%, 대중교통 20%) / 셔틀 미제공 시(택시 50%, 대중교통 50%)</w:t>
+              <w:br/>
+              <w:t>• 5.3 산정 공식:</w:t>
+              <w:br/>
+              <w:t xml:space="preserve">  - 연소 공식 1: 이동거리(km) × 배출계수(kgCO2e/km)</w:t>
+              <w:br/>
+              <w:t xml:space="preserve">  - 연소 공식 2: 이동거리(km) × 승객수 × 배출계수(kgCO2e/p·km)</w:t>
+              <w:br/>
+              <w:t xml:space="preserve">  - 연소 공식 3: 연료소비량(L) × 배출계수(kgCO2e/L)</w:t>
+              <w:br/>
+              <w:t xml:space="preserve">  - WTT 상류 공식 1, 2, 3: 각 항목별 WTT 배출계수 적용</w:t>
+            </w:r>
+          </w:p>
+        </w:tc>
+      </w:tr>
+      <w:tr>
+        <w:tc>
+          <w:tcPr>
+            <w:tcW w:type="dxa" w:w="2016"/>
+            <w:shd w:fill="F1F5F9"/>
+            <w:tcMar>
+              <w:top w:w="80" w:type="dxa"/>
+              <w:bottom w:w="80" w:type="dxa"/>
+              <w:left w:w="100" w:type="dxa"/>
+              <w:right w:w="100" w:type="dxa"/>
+            </w:tcMar>
+          </w:tcPr>
+          <w:p>
+            <w:r>
+              <w:rPr>
+                <w:rFonts w:ascii="Malgun Gothic" w:hAnsi="Malgun Gothic"/>
+                <w:b/>
+                <w:color w:val="334155"/>
+                <w:sz w:val="19"/>
+              </w:rPr>
+              <w:t>산식 의미 및 계수</w:t>
+            </w:r>
+          </w:p>
+        </w:tc>
+        <w:tc>
+          <w:tcPr>
+            <w:tcW w:type="dxa" w:w="7344"/>
+            <w:tcMar>
+              <w:top w:w="80" w:type="dxa"/>
+              <w:bottom w:w="80" w:type="dxa"/>
+              <w:left w:w="100" w:type="dxa"/>
+              <w:right w:w="100" w:type="dxa"/>
+            </w:tcMar>
+          </w:tcPr>
+          <w:p>
+            <w:r>
+              <w:rPr>
+                <w:rFonts w:ascii="Malgun Gothic" w:hAnsi="Malgun Gothic"/>
+                <w:sz w:val="19"/>
+              </w:rPr>
+              <w:t>NZCE Cat 4/5 및 GHG Protocol Scope 3 현지 교통 가이드라인 5.1~5.3 표준 완벽 부합</w:t>
+            </w:r>
+          </w:p>
+        </w:tc>
+      </w:tr>
+    </w:tbl>
+    <w:p>
+      <w:pPr>
+        <w:spacing w:after="120"/>
+      </w:pPr>
+    </w:p>
+    <w:p>
+      <w:pPr>
         <w:pStyle w:val="Heading1"/>
         <w:spacing w:before="320" w:after="160"/>
       </w:pPr>

</xml_diff>